<commit_message>
Update SRS, SAD and Test Plan with team names and SRNs
</commit_message>
<xml_diff>
--- a/docs/SAD_Chat_Application_Team5.docx
+++ b/docs/SAD_Chat_Application_Team5.docx
@@ -67,7 +67,7 @@
           <w:sz w:val="21"/>
           <w:szCs w:val="21"/>
         </w:rPr>
-        <w:t xml:space="preserve"> 1.0</w:t>
+        <w:t xml:space="preserve"> 1.1</w:t>
       </w:r>
     </w:p>
     <w:p>
@@ -113,7 +113,7 @@
           <w:sz w:val="21"/>
           <w:szCs w:val="21"/>
         </w:rPr>
-        <w:t xml:space="preserve"> 04-10-2026</w:t>
+        <w:t xml:space="preserve"> 07-10-2026</w:t>
       </w:r>
     </w:p>
     <w:p>
@@ -446,6 +446,139 @@
           </w:p>
         </w:tc>
       </w:tr>
+      <w:tr>
+        <w:trPr>
+          <w:cantSplit/>
+        </w:trPr>
+        <w:tc>
+          <w:tcPr>
+            <w:tcW w:type="dxa" w:w="1200"/>
+            <w:tcBorders>
+              <w:top w:val="single" w:color="999999" w:sz="4"/>
+              <w:left w:val="single" w:color="999999" w:sz="4"/>
+              <w:bottom w:val="single" w:color="999999" w:sz="4"/>
+              <w:right w:val="single" w:color="999999" w:sz="4"/>
+            </w:tcBorders>
+            <w:tcMar>
+              <w:top w:type="dxa" w:w="50"/>
+              <w:left w:type="dxa" w:w="90"/>
+              <w:bottom w:type="dxa" w:w="50"/>
+              <w:right w:type="dxa" w:w="90"/>
+            </w:tcMar>
+          </w:tcPr>
+          <w:p>
+            <w:pPr>
+              <w:spacing w:after="20"/>
+            </w:pPr>
+            <w:r>
+              <w:rPr>
+                <w:rFonts w:ascii="Calibri" w:cs="Calibri" w:eastAsia="Calibri" w:hAnsi="Calibri"/>
+                <w:b w:val="false"/>
+                <w:bCs w:val="false"/>
+                <w:sz w:val="19"/>
+                <w:szCs w:val="19"/>
+              </w:rPr>
+              <w:t xml:space="preserve">1.1</w:t>
+            </w:r>
+          </w:p>
+        </w:tc>
+        <w:tc>
+          <w:tcPr>
+            <w:tcW w:type="dxa" w:w="1700"/>
+            <w:tcBorders>
+              <w:top w:val="single" w:color="999999" w:sz="4"/>
+              <w:left w:val="single" w:color="999999" w:sz="4"/>
+              <w:bottom w:val="single" w:color="999999" w:sz="4"/>
+              <w:right w:val="single" w:color="999999" w:sz="4"/>
+            </w:tcBorders>
+            <w:tcMar>
+              <w:top w:type="dxa" w:w="50"/>
+              <w:left w:type="dxa" w:w="90"/>
+              <w:bottom w:type="dxa" w:w="50"/>
+              <w:right w:type="dxa" w:w="90"/>
+            </w:tcMar>
+          </w:tcPr>
+          <w:p>
+            <w:pPr>
+              <w:spacing w:after="20"/>
+            </w:pPr>
+            <w:r>
+              <w:rPr>
+                <w:rFonts w:ascii="Calibri" w:cs="Calibri" w:eastAsia="Calibri" w:hAnsi="Calibri"/>
+                <w:b w:val="false"/>
+                <w:bCs w:val="false"/>
+                <w:sz w:val="19"/>
+                <w:szCs w:val="19"/>
+              </w:rPr>
+              <w:t xml:space="preserve">07-10-2026</w:t>
+            </w:r>
+          </w:p>
+        </w:tc>
+        <w:tc>
+          <w:tcPr>
+            <w:tcW w:type="dxa" w:w="1800"/>
+            <w:tcBorders>
+              <w:top w:val="single" w:color="999999" w:sz="4"/>
+              <w:left w:val="single" w:color="999999" w:sz="4"/>
+              <w:bottom w:val="single" w:color="999999" w:sz="4"/>
+              <w:right w:val="single" w:color="999999" w:sz="4"/>
+            </w:tcBorders>
+            <w:tcMar>
+              <w:top w:type="dxa" w:w="50"/>
+              <w:left w:type="dxa" w:w="90"/>
+              <w:bottom w:type="dxa" w:w="50"/>
+              <w:right w:type="dxa" w:w="90"/>
+            </w:tcMar>
+          </w:tcPr>
+          <w:p>
+            <w:pPr>
+              <w:spacing w:after="20"/>
+            </w:pPr>
+            <w:r>
+              <w:rPr>
+                <w:rFonts w:ascii="Calibri" w:cs="Calibri" w:eastAsia="Calibri" w:hAnsi="Calibri"/>
+                <w:b w:val="false"/>
+                <w:bCs w:val="false"/>
+                <w:sz w:val="19"/>
+                <w:szCs w:val="19"/>
+              </w:rPr>
+              <w:t xml:space="preserve">Team 5</w:t>
+            </w:r>
+          </w:p>
+        </w:tc>
+        <w:tc>
+          <w:tcPr>
+            <w:tcW w:type="dxa" w:w="4938"/>
+            <w:tcBorders>
+              <w:top w:val="single" w:color="999999" w:sz="4"/>
+              <w:left w:val="single" w:color="999999" w:sz="4"/>
+              <w:bottom w:val="single" w:color="999999" w:sz="4"/>
+              <w:right w:val="single" w:color="999999" w:sz="4"/>
+            </w:tcBorders>
+            <w:tcMar>
+              <w:top w:type="dxa" w:w="50"/>
+              <w:left w:type="dxa" w:w="90"/>
+              <w:bottom w:type="dxa" w:w="50"/>
+              <w:right w:type="dxa" w:w="90"/>
+            </w:tcMar>
+          </w:tcPr>
+          <w:p>
+            <w:pPr>
+              <w:spacing w:after="20"/>
+            </w:pPr>
+            <w:r>
+              <w:rPr>
+                <w:rFonts w:ascii="Calibri" w:cs="Calibri" w:eastAsia="Calibri" w:hAnsi="Calibri"/>
+                <w:b w:val="false"/>
+                <w:bCs w:val="false"/>
+                <w:sz w:val="19"/>
+                <w:szCs w:val="19"/>
+              </w:rPr>
+              <w:t xml:space="preserve">Added team member names, SRNs and roles</w:t>
+            </w:r>
+          </w:p>
+        </w:tc>
+      </w:tr>
     </w:tbl>
     <w:p>
       <w:pPr>
@@ -478,9 +611,9 @@
         </w:tblBorders>
       </w:tblPr>
       <w:tblGrid>
-        <w:gridCol w:w="4000"/>
-        <w:gridCol w:w="3000"/>
-        <w:gridCol w:w="2638"/>
+        <w:gridCol w:w="4600"/>
+        <w:gridCol w:w="3200"/>
+        <w:gridCol w:w="1838"/>
       </w:tblGrid>
       <w:tr>
         <w:trPr>
@@ -489,7 +622,7 @@
         </w:trPr>
         <w:tc>
           <w:tcPr>
-            <w:tcW w:type="dxa" w:w="4000"/>
+            <w:tcW w:type="dxa" w:w="4600"/>
             <w:tcBorders>
               <w:top w:val="single" w:color="999999" w:sz="4"/>
               <w:left w:val="single" w:color="999999" w:sz="4"/>
@@ -522,7 +655,7 @@
         </w:tc>
         <w:tc>
           <w:tcPr>
-            <w:tcW w:type="dxa" w:w="3000"/>
+            <w:tcW w:type="dxa" w:w="3200"/>
             <w:tcBorders>
               <w:top w:val="single" w:color="999999" w:sz="4"/>
               <w:left w:val="single" w:color="999999" w:sz="4"/>
@@ -549,13 +682,13 @@
                 <w:sz w:val="19"/>
                 <w:szCs w:val="19"/>
               </w:rPr>
-              <w:t xml:space="preserve">Name</w:t>
-            </w:r>
-          </w:p>
-        </w:tc>
-        <w:tc>
-          <w:tcPr>
-            <w:tcW w:type="dxa" w:w="2638"/>
+              <w:t xml:space="preserve">Name (SRN)</w:t>
+            </w:r>
+          </w:p>
+        </w:tc>
+        <w:tc>
+          <w:tcPr>
+            <w:tcW w:type="dxa" w:w="1838"/>
             <w:tcBorders>
               <w:top w:val="single" w:color="999999" w:sz="4"/>
               <w:left w:val="single" w:color="999999" w:sz="4"/>
@@ -593,71 +726,71 @@
         </w:trPr>
         <w:tc>
           <w:tcPr>
-            <w:tcW w:type="dxa" w:w="4000"/>
-            <w:tcBorders>
-              <w:top w:val="single" w:color="999999" w:sz="4"/>
-              <w:left w:val="single" w:color="999999" w:sz="4"/>
-              <w:bottom w:val="single" w:color="999999" w:sz="4"/>
-              <w:right w:val="single" w:color="999999" w:sz="4"/>
-            </w:tcBorders>
-            <w:tcMar>
-              <w:top w:type="dxa" w:w="50"/>
-              <w:left w:type="dxa" w:w="90"/>
-              <w:bottom w:type="dxa" w:w="50"/>
-              <w:right w:type="dxa" w:w="90"/>
-            </w:tcMar>
-          </w:tcPr>
-          <w:p>
-            <w:pPr>
-              <w:spacing w:after="20"/>
-            </w:pPr>
-            <w:r>
-              <w:rPr>
-                <w:rFonts w:ascii="Calibri" w:cs="Calibri" w:eastAsia="Calibri" w:hAnsi="Calibri"/>
-                <w:b w:val="false"/>
-                <w:bCs w:val="false"/>
-                <w:sz w:val="19"/>
-                <w:szCs w:val="19"/>
-              </w:rPr>
-              <w:t xml:space="preserve">Team Member 1 (Security, Authentication)</w:t>
-            </w:r>
-          </w:p>
-        </w:tc>
-        <w:tc>
-          <w:tcPr>
-            <w:tcW w:type="dxa" w:w="3000"/>
-            <w:tcBorders>
-              <w:top w:val="single" w:color="999999" w:sz="4"/>
-              <w:left w:val="single" w:color="999999" w:sz="4"/>
-              <w:bottom w:val="single" w:color="999999" w:sz="4"/>
-              <w:right w:val="single" w:color="999999" w:sz="4"/>
-            </w:tcBorders>
-            <w:tcMar>
-              <w:top w:type="dxa" w:w="50"/>
-              <w:left w:type="dxa" w:w="90"/>
-              <w:bottom w:type="dxa" w:w="50"/>
-              <w:right w:type="dxa" w:w="90"/>
-            </w:tcMar>
-          </w:tcPr>
-          <w:p>
-            <w:pPr>
-              <w:spacing w:after="20"/>
-            </w:pPr>
-            <w:r>
-              <w:rPr>
-                <w:rFonts w:ascii="Calibri" w:cs="Calibri" w:eastAsia="Calibri" w:hAnsi="Calibri"/>
-                <w:b w:val="false"/>
-                <w:bCs w:val="false"/>
-                <w:sz w:val="19"/>
-                <w:szCs w:val="19"/>
-              </w:rPr>
-              <w:t xml:space="preserve">[Member 1 name]</w:t>
-            </w:r>
-          </w:p>
-        </w:tc>
-        <w:tc>
-          <w:tcPr>
-            <w:tcW w:type="dxa" w:w="2638"/>
+            <w:tcW w:type="dxa" w:w="4600"/>
+            <w:tcBorders>
+              <w:top w:val="single" w:color="999999" w:sz="4"/>
+              <w:left w:val="single" w:color="999999" w:sz="4"/>
+              <w:bottom w:val="single" w:color="999999" w:sz="4"/>
+              <w:right w:val="single" w:color="999999" w:sz="4"/>
+            </w:tcBorders>
+            <w:tcMar>
+              <w:top w:type="dxa" w:w="50"/>
+              <w:left w:type="dxa" w:w="90"/>
+              <w:bottom w:type="dxa" w:w="50"/>
+              <w:right w:type="dxa" w:w="90"/>
+            </w:tcMar>
+          </w:tcPr>
+          <w:p>
+            <w:pPr>
+              <w:spacing w:after="20"/>
+            </w:pPr>
+            <w:r>
+              <w:rPr>
+                <w:rFonts w:ascii="Calibri" w:cs="Calibri" w:eastAsia="Calibri" w:hAnsi="Calibri"/>
+                <w:b w:val="false"/>
+                <w:bCs w:val="false"/>
+                <w:sz w:val="19"/>
+                <w:szCs w:val="19"/>
+              </w:rPr>
+              <w:t xml:space="preserve">Member 1: Authentication and Security (SRS 5.1, SEC-1 to SEC-8)</w:t>
+            </w:r>
+          </w:p>
+        </w:tc>
+        <w:tc>
+          <w:tcPr>
+            <w:tcW w:type="dxa" w:w="3200"/>
+            <w:tcBorders>
+              <w:top w:val="single" w:color="999999" w:sz="4"/>
+              <w:left w:val="single" w:color="999999" w:sz="4"/>
+              <w:bottom w:val="single" w:color="999999" w:sz="4"/>
+              <w:right w:val="single" w:color="999999" w:sz="4"/>
+            </w:tcBorders>
+            <w:tcMar>
+              <w:top w:type="dxa" w:w="50"/>
+              <w:left w:type="dxa" w:w="90"/>
+              <w:bottom w:type="dxa" w:w="50"/>
+              <w:right w:type="dxa" w:w="90"/>
+            </w:tcMar>
+          </w:tcPr>
+          <w:p>
+            <w:pPr>
+              <w:spacing w:after="20"/>
+            </w:pPr>
+            <w:r>
+              <w:rPr>
+                <w:rFonts w:ascii="Calibri" w:cs="Calibri" w:eastAsia="Calibri" w:hAnsi="Calibri"/>
+                <w:b w:val="false"/>
+                <w:bCs w:val="false"/>
+                <w:sz w:val="19"/>
+                <w:szCs w:val="19"/>
+              </w:rPr>
+              <w:t xml:space="preserve">Gagan Eswar (PES1UG24CS165)</w:t>
+            </w:r>
+          </w:p>
+        </w:tc>
+        <w:tc>
+          <w:tcPr>
+            <w:tcW w:type="dxa" w:w="1838"/>
             <w:tcBorders>
               <w:top w:val="single" w:color="999999" w:sz="4"/>
               <w:left w:val="single" w:color="999999" w:sz="4"/>
@@ -684,71 +817,71 @@
         </w:trPr>
         <w:tc>
           <w:tcPr>
-            <w:tcW w:type="dxa" w:w="4000"/>
-            <w:tcBorders>
-              <w:top w:val="single" w:color="999999" w:sz="4"/>
-              <w:left w:val="single" w:color="999999" w:sz="4"/>
-              <w:bottom w:val="single" w:color="999999" w:sz="4"/>
-              <w:right w:val="single" w:color="999999" w:sz="4"/>
-            </w:tcBorders>
-            <w:tcMar>
-              <w:top w:type="dxa" w:w="50"/>
-              <w:left w:type="dxa" w:w="90"/>
-              <w:bottom w:type="dxa" w:w="50"/>
-              <w:right w:type="dxa" w:w="90"/>
-            </w:tcMar>
-          </w:tcPr>
-          <w:p>
-            <w:pPr>
-              <w:spacing w:after="20"/>
-            </w:pPr>
-            <w:r>
-              <w:rPr>
-                <w:rFonts w:ascii="Calibri" w:cs="Calibri" w:eastAsia="Calibri" w:hAnsi="Calibri"/>
-                <w:b w:val="false"/>
-                <w:bCs w:val="false"/>
-                <w:sz w:val="19"/>
-                <w:szCs w:val="19"/>
-              </w:rPr>
-              <w:t xml:space="preserve">Team Member 2 (Messaging, History)</w:t>
-            </w:r>
-          </w:p>
-        </w:tc>
-        <w:tc>
-          <w:tcPr>
-            <w:tcW w:type="dxa" w:w="3000"/>
-            <w:tcBorders>
-              <w:top w:val="single" w:color="999999" w:sz="4"/>
-              <w:left w:val="single" w:color="999999" w:sz="4"/>
-              <w:bottom w:val="single" w:color="999999" w:sz="4"/>
-              <w:right w:val="single" w:color="999999" w:sz="4"/>
-            </w:tcBorders>
-            <w:tcMar>
-              <w:top w:type="dxa" w:w="50"/>
-              <w:left w:type="dxa" w:w="90"/>
-              <w:bottom w:type="dxa" w:w="50"/>
-              <w:right w:type="dxa" w:w="90"/>
-            </w:tcMar>
-          </w:tcPr>
-          <w:p>
-            <w:pPr>
-              <w:spacing w:after="20"/>
-            </w:pPr>
-            <w:r>
-              <w:rPr>
-                <w:rFonts w:ascii="Calibri" w:cs="Calibri" w:eastAsia="Calibri" w:hAnsi="Calibri"/>
-                <w:b w:val="false"/>
-                <w:bCs w:val="false"/>
-                <w:sz w:val="19"/>
-                <w:szCs w:val="19"/>
-              </w:rPr>
-              <w:t xml:space="preserve">[Member 2 name]</w:t>
-            </w:r>
-          </w:p>
-        </w:tc>
-        <w:tc>
-          <w:tcPr>
-            <w:tcW w:type="dxa" w:w="2638"/>
+            <w:tcW w:type="dxa" w:w="4600"/>
+            <w:tcBorders>
+              <w:top w:val="single" w:color="999999" w:sz="4"/>
+              <w:left w:val="single" w:color="999999" w:sz="4"/>
+              <w:bottom w:val="single" w:color="999999" w:sz="4"/>
+              <w:right w:val="single" w:color="999999" w:sz="4"/>
+            </w:tcBorders>
+            <w:tcMar>
+              <w:top w:type="dxa" w:w="50"/>
+              <w:left w:type="dxa" w:w="90"/>
+              <w:bottom w:type="dxa" w:w="50"/>
+              <w:right w:type="dxa" w:w="90"/>
+            </w:tcMar>
+          </w:tcPr>
+          <w:p>
+            <w:pPr>
+              <w:spacing w:after="20"/>
+            </w:pPr>
+            <w:r>
+              <w:rPr>
+                <w:rFonts w:ascii="Calibri" w:cs="Calibri" w:eastAsia="Calibri" w:hAnsi="Calibri"/>
+                <w:b w:val="false"/>
+                <w:bCs w:val="false"/>
+                <w:sz w:val="19"/>
+                <w:szCs w:val="19"/>
+              </w:rPr>
+              <w:t xml:space="preserve">Member 2: Messaging, Chat History and Performance (SRS 5.2, 5.5, PERF)</w:t>
+            </w:r>
+          </w:p>
+        </w:tc>
+        <w:tc>
+          <w:tcPr>
+            <w:tcW w:type="dxa" w:w="3200"/>
+            <w:tcBorders>
+              <w:top w:val="single" w:color="999999" w:sz="4"/>
+              <w:left w:val="single" w:color="999999" w:sz="4"/>
+              <w:bottom w:val="single" w:color="999999" w:sz="4"/>
+              <w:right w:val="single" w:color="999999" w:sz="4"/>
+            </w:tcBorders>
+            <w:tcMar>
+              <w:top w:type="dxa" w:w="50"/>
+              <w:left w:type="dxa" w:w="90"/>
+              <w:bottom w:type="dxa" w:w="50"/>
+              <w:right w:type="dxa" w:w="90"/>
+            </w:tcMar>
+          </w:tcPr>
+          <w:p>
+            <w:pPr>
+              <w:spacing w:after="20"/>
+            </w:pPr>
+            <w:r>
+              <w:rPr>
+                <w:rFonts w:ascii="Calibri" w:cs="Calibri" w:eastAsia="Calibri" w:hAnsi="Calibri"/>
+                <w:b w:val="false"/>
+                <w:bCs w:val="false"/>
+                <w:sz w:val="19"/>
+                <w:szCs w:val="19"/>
+              </w:rPr>
+              <w:t xml:space="preserve">Chetha Samrutha (PES1UG24CS131)</w:t>
+            </w:r>
+          </w:p>
+        </w:tc>
+        <w:tc>
+          <w:tcPr>
+            <w:tcW w:type="dxa" w:w="1838"/>
             <w:tcBorders>
               <w:top w:val="single" w:color="999999" w:sz="4"/>
               <w:left w:val="single" w:color="999999" w:sz="4"/>
@@ -775,71 +908,71 @@
         </w:trPr>
         <w:tc>
           <w:tcPr>
-            <w:tcW w:type="dxa" w:w="4000"/>
-            <w:tcBorders>
-              <w:top w:val="single" w:color="999999" w:sz="4"/>
-              <w:left w:val="single" w:color="999999" w:sz="4"/>
-              <w:bottom w:val="single" w:color="999999" w:sz="4"/>
-              <w:right w:val="single" w:color="999999" w:sz="4"/>
-            </w:tcBorders>
-            <w:tcMar>
-              <w:top w:type="dxa" w:w="50"/>
-              <w:left w:type="dxa" w:w="90"/>
-              <w:bottom w:type="dxa" w:w="50"/>
-              <w:right w:type="dxa" w:w="90"/>
-            </w:tcMar>
-          </w:tcPr>
-          <w:p>
-            <w:pPr>
-              <w:spacing w:after="20"/>
-            </w:pPr>
-            <w:r>
-              <w:rPr>
-                <w:rFonts w:ascii="Calibri" w:cs="Calibri" w:eastAsia="Calibri" w:hAnsi="Calibri"/>
-                <w:b w:val="false"/>
-                <w:bCs w:val="false"/>
-                <w:sz w:val="19"/>
-                <w:szCs w:val="19"/>
-              </w:rPr>
-              <w:t xml:space="preserve">Team Member 3 (Group Chat, Profile, UX)</w:t>
-            </w:r>
-          </w:p>
-        </w:tc>
-        <w:tc>
-          <w:tcPr>
-            <w:tcW w:type="dxa" w:w="3000"/>
-            <w:tcBorders>
-              <w:top w:val="single" w:color="999999" w:sz="4"/>
-              <w:left w:val="single" w:color="999999" w:sz="4"/>
-              <w:bottom w:val="single" w:color="999999" w:sz="4"/>
-              <w:right w:val="single" w:color="999999" w:sz="4"/>
-            </w:tcBorders>
-            <w:tcMar>
-              <w:top w:type="dxa" w:w="50"/>
-              <w:left w:type="dxa" w:w="90"/>
-              <w:bottom w:type="dxa" w:w="50"/>
-              <w:right w:type="dxa" w:w="90"/>
-            </w:tcMar>
-          </w:tcPr>
-          <w:p>
-            <w:pPr>
-              <w:spacing w:after="20"/>
-            </w:pPr>
-            <w:r>
-              <w:rPr>
-                <w:rFonts w:ascii="Calibri" w:cs="Calibri" w:eastAsia="Calibri" w:hAnsi="Calibri"/>
-                <w:b w:val="false"/>
-                <w:bCs w:val="false"/>
-                <w:sz w:val="19"/>
-                <w:szCs w:val="19"/>
-              </w:rPr>
-              <w:t xml:space="preserve">[Member 3 name]</w:t>
-            </w:r>
-          </w:p>
-        </w:tc>
-        <w:tc>
-          <w:tcPr>
-            <w:tcW w:type="dxa" w:w="2638"/>
+            <w:tcW w:type="dxa" w:w="4600"/>
+            <w:tcBorders>
+              <w:top w:val="single" w:color="999999" w:sz="4"/>
+              <w:left w:val="single" w:color="999999" w:sz="4"/>
+              <w:bottom w:val="single" w:color="999999" w:sz="4"/>
+              <w:right w:val="single" w:color="999999" w:sz="4"/>
+            </w:tcBorders>
+            <w:tcMar>
+              <w:top w:type="dxa" w:w="50"/>
+              <w:left w:type="dxa" w:w="90"/>
+              <w:bottom w:type="dxa" w:w="50"/>
+              <w:right w:type="dxa" w:w="90"/>
+            </w:tcMar>
+          </w:tcPr>
+          <w:p>
+            <w:pPr>
+              <w:spacing w:after="20"/>
+            </w:pPr>
+            <w:r>
+              <w:rPr>
+                <w:rFonts w:ascii="Calibri" w:cs="Calibri" w:eastAsia="Calibri" w:hAnsi="Calibri"/>
+                <w:b w:val="false"/>
+                <w:bCs w:val="false"/>
+                <w:sz w:val="19"/>
+                <w:szCs w:val="19"/>
+              </w:rPr>
+              <w:t xml:space="preserve">Member 3: Group Chat, Profile/Search and Usability (SRS 5.3, 5.7, UI)</w:t>
+            </w:r>
+          </w:p>
+        </w:tc>
+        <w:tc>
+          <w:tcPr>
+            <w:tcW w:type="dxa" w:w="3200"/>
+            <w:tcBorders>
+              <w:top w:val="single" w:color="999999" w:sz="4"/>
+              <w:left w:val="single" w:color="999999" w:sz="4"/>
+              <w:bottom w:val="single" w:color="999999" w:sz="4"/>
+              <w:right w:val="single" w:color="999999" w:sz="4"/>
+            </w:tcBorders>
+            <w:tcMar>
+              <w:top w:type="dxa" w:w="50"/>
+              <w:left w:type="dxa" w:w="90"/>
+              <w:bottom w:type="dxa" w:w="50"/>
+              <w:right w:type="dxa" w:w="90"/>
+            </w:tcMar>
+          </w:tcPr>
+          <w:p>
+            <w:pPr>
+              <w:spacing w:after="20"/>
+            </w:pPr>
+            <w:r>
+              <w:rPr>
+                <w:rFonts w:ascii="Calibri" w:cs="Calibri" w:eastAsia="Calibri" w:hAnsi="Calibri"/>
+                <w:b w:val="false"/>
+                <w:bCs w:val="false"/>
+                <w:sz w:val="19"/>
+                <w:szCs w:val="19"/>
+              </w:rPr>
+              <w:t xml:space="preserve">Harsh Kalekar (PES1UG24CS183)</w:t>
+            </w:r>
+          </w:p>
+        </w:tc>
+        <w:tc>
+          <w:tcPr>
+            <w:tcW w:type="dxa" w:w="1838"/>
             <w:tcBorders>
               <w:top w:val="single" w:color="999999" w:sz="4"/>
               <w:left w:val="single" w:color="999999" w:sz="4"/>
@@ -866,71 +999,71 @@
         </w:trPr>
         <w:tc>
           <w:tcPr>
-            <w:tcW w:type="dxa" w:w="4000"/>
-            <w:tcBorders>
-              <w:top w:val="single" w:color="999999" w:sz="4"/>
-              <w:left w:val="single" w:color="999999" w:sz="4"/>
-              <w:bottom w:val="single" w:color="999999" w:sz="4"/>
-              <w:right w:val="single" w:color="999999" w:sz="4"/>
-            </w:tcBorders>
-            <w:tcMar>
-              <w:top w:type="dxa" w:w="50"/>
-              <w:left w:type="dxa" w:w="90"/>
-              <w:bottom w:type="dxa" w:w="50"/>
-              <w:right w:type="dxa" w:w="90"/>
-            </w:tcMar>
-          </w:tcPr>
-          <w:p>
-            <w:pPr>
-              <w:spacing w:after="20"/>
-            </w:pPr>
-            <w:r>
-              <w:rPr>
-                <w:rFonts w:ascii="Calibri" w:cs="Calibri" w:eastAsia="Calibri" w:hAnsi="Calibri"/>
-                <w:b w:val="false"/>
-                <w:bCs w:val="false"/>
-                <w:sz w:val="19"/>
-                <w:szCs w:val="19"/>
-              </w:rPr>
-              <w:t xml:space="preserve">Team Member 4 (Presence, Status, Reliability)</w:t>
-            </w:r>
-          </w:p>
-        </w:tc>
-        <w:tc>
-          <w:tcPr>
-            <w:tcW w:type="dxa" w:w="3000"/>
-            <w:tcBorders>
-              <w:top w:val="single" w:color="999999" w:sz="4"/>
-              <w:left w:val="single" w:color="999999" w:sz="4"/>
-              <w:bottom w:val="single" w:color="999999" w:sz="4"/>
-              <w:right w:val="single" w:color="999999" w:sz="4"/>
-            </w:tcBorders>
-            <w:tcMar>
-              <w:top w:type="dxa" w:w="50"/>
-              <w:left w:type="dxa" w:w="90"/>
-              <w:bottom w:type="dxa" w:w="50"/>
-              <w:right w:type="dxa" w:w="90"/>
-            </w:tcMar>
-          </w:tcPr>
-          <w:p>
-            <w:pPr>
-              <w:spacing w:after="20"/>
-            </w:pPr>
-            <w:r>
-              <w:rPr>
-                <w:rFonts w:ascii="Calibri" w:cs="Calibri" w:eastAsia="Calibri" w:hAnsi="Calibri"/>
-                <w:b w:val="false"/>
-                <w:bCs w:val="false"/>
-                <w:sz w:val="19"/>
-                <w:szCs w:val="19"/>
-              </w:rPr>
-              <w:t xml:space="preserve">[Member 4 name]</w:t>
-            </w:r>
-          </w:p>
-        </w:tc>
-        <w:tc>
-          <w:tcPr>
-            <w:tcW w:type="dxa" w:w="2638"/>
+            <w:tcW w:type="dxa" w:w="4600"/>
+            <w:tcBorders>
+              <w:top w:val="single" w:color="999999" w:sz="4"/>
+              <w:left w:val="single" w:color="999999" w:sz="4"/>
+              <w:bottom w:val="single" w:color="999999" w:sz="4"/>
+              <w:right w:val="single" w:color="999999" w:sz="4"/>
+            </w:tcBorders>
+            <w:tcMar>
+              <w:top w:type="dxa" w:w="50"/>
+              <w:left w:type="dxa" w:w="90"/>
+              <w:bottom w:type="dxa" w:w="50"/>
+              <w:right w:type="dxa" w:w="90"/>
+            </w:tcMar>
+          </w:tcPr>
+          <w:p>
+            <w:pPr>
+              <w:spacing w:after="20"/>
+            </w:pPr>
+            <w:r>
+              <w:rPr>
+                <w:rFonts w:ascii="Calibri" w:cs="Calibri" w:eastAsia="Calibri" w:hAnsi="Calibri"/>
+                <w:b w:val="false"/>
+                <w:bCs w:val="false"/>
+                <w:sz w:val="19"/>
+                <w:szCs w:val="19"/>
+              </w:rPr>
+              <w:t xml:space="preserve">Member 4: Presence, Status, Connection Handling and Reliability (SRS 5.4, 5.6)</w:t>
+            </w:r>
+          </w:p>
+        </w:tc>
+        <w:tc>
+          <w:tcPr>
+            <w:tcW w:type="dxa" w:w="3200"/>
+            <w:tcBorders>
+              <w:top w:val="single" w:color="999999" w:sz="4"/>
+              <w:left w:val="single" w:color="999999" w:sz="4"/>
+              <w:bottom w:val="single" w:color="999999" w:sz="4"/>
+              <w:right w:val="single" w:color="999999" w:sz="4"/>
+            </w:tcBorders>
+            <w:tcMar>
+              <w:top w:type="dxa" w:w="50"/>
+              <w:left w:type="dxa" w:w="90"/>
+              <w:bottom w:type="dxa" w:w="50"/>
+              <w:right w:type="dxa" w:w="90"/>
+            </w:tcMar>
+          </w:tcPr>
+          <w:p>
+            <w:pPr>
+              <w:spacing w:after="20"/>
+            </w:pPr>
+            <w:r>
+              <w:rPr>
+                <w:rFonts w:ascii="Calibri" w:cs="Calibri" w:eastAsia="Calibri" w:hAnsi="Calibri"/>
+                <w:b w:val="false"/>
+                <w:bCs w:val="false"/>
+                <w:sz w:val="19"/>
+                <w:szCs w:val="19"/>
+              </w:rPr>
+              <w:t xml:space="preserve">Dhanush K S (PES1UG24CS148)</w:t>
+            </w:r>
+          </w:p>
+        </w:tc>
+        <w:tc>
+          <w:tcPr>
+            <w:tcW w:type="dxa" w:w="1838"/>
             <w:tcBorders>
               <w:top w:val="single" w:color="999999" w:sz="4"/>
               <w:left w:val="single" w:color="999999" w:sz="4"/>
@@ -957,7 +1090,7 @@
         </w:trPr>
         <w:tc>
           <w:tcPr>
-            <w:tcW w:type="dxa" w:w="4000"/>
+            <w:tcW w:type="dxa" w:w="4600"/>
             <w:tcBorders>
               <w:top w:val="single" w:color="999999" w:sz="4"/>
               <w:left w:val="single" w:color="999999" w:sz="4"/>
@@ -989,29 +1122,29 @@
         </w:tc>
         <w:tc>
           <w:tcPr>
-            <w:tcW w:type="dxa" w:w="3000"/>
-            <w:tcBorders>
-              <w:top w:val="single" w:color="999999" w:sz="4"/>
-              <w:left w:val="single" w:color="999999" w:sz="4"/>
-              <w:bottom w:val="single" w:color="999999" w:sz="4"/>
-              <w:right w:val="single" w:color="999999" w:sz="4"/>
-            </w:tcBorders>
-            <w:tcMar>
-              <w:top w:type="dxa" w:w="50"/>
-              <w:left w:type="dxa" w:w="90"/>
-              <w:bottom w:type="dxa" w:w="50"/>
-              <w:right w:type="dxa" w:w="90"/>
-            </w:tcMar>
-          </w:tcPr>
-          <w:p>
-            <w:pPr>
-              <w:spacing w:after="20"/>
-            </w:pPr>
-          </w:p>
-        </w:tc>
-        <w:tc>
-          <w:tcPr>
-            <w:tcW w:type="dxa" w:w="2638"/>
+            <w:tcW w:type="dxa" w:w="3200"/>
+            <w:tcBorders>
+              <w:top w:val="single" w:color="999999" w:sz="4"/>
+              <w:left w:val="single" w:color="999999" w:sz="4"/>
+              <w:bottom w:val="single" w:color="999999" w:sz="4"/>
+              <w:right w:val="single" w:color="999999" w:sz="4"/>
+            </w:tcBorders>
+            <w:tcMar>
+              <w:top w:type="dxa" w:w="50"/>
+              <w:left w:type="dxa" w:w="90"/>
+              <w:bottom w:type="dxa" w:w="50"/>
+              <w:right w:type="dxa" w:w="90"/>
+            </w:tcMar>
+          </w:tcPr>
+          <w:p>
+            <w:pPr>
+              <w:spacing w:after="20"/>
+            </w:pPr>
+          </w:p>
+        </w:tc>
+        <w:tc>
+          <w:tcPr>
+            <w:tcW w:type="dxa" w:w="1838"/>
             <w:tcBorders>
               <w:top w:val="single" w:color="999999" w:sz="4"/>
               <w:left w:val="single" w:color="999999" w:sz="4"/>

</xml_diff>